<commit_message>
Ngữ văn Bài 3 (10, 11, 12): đối chiếu SGV, bổ sung Củng cố – mở rộng, Thực hành đọc, bảng đánh giá theo SGK
Co-Authored-By: Claude Opus 5.5 <noreply@anthropic.com>
</commit_message>
<xml_diff>
--- a/mon/ngu_van/khbd/lop10/KHBD_NGUVAN10_Bai3_NgheThuatThuyetPhucTrongVanNghiLuan_T23-35.docx
+++ b/mon/ngu_van/khbd/lop10/KHBD_NGUVAN10_Bai3_NgheThuatThuyetPhucTrongVanNghiLuan_T23-35.docx
@@ -1011,46 +1011,59 @@
                 <w:b w:val="0"/>
                 <w:i w:val="0"/>
               </w:rPr>
-              <w:t>- Đoạn 3: mở rộng, nâng cao – việc khen thưởng chưa đủ lưu vẻ sáng lâu dài nên dựng đá đề danh ở cửa Hiền Quan.</w:t>
-            </w:r>
-          </w:p>
-          <w:p>
-            <w:pPr>
-              <w:spacing w:before="0" w:after="0"/>
-              <w:jc w:val="both"/>
-            </w:pPr>
-            <w:r>
-              <w:rPr>
-                <w:b w:val="0"/>
-                <w:i w:val="0"/>
-              </w:rPr>
-              <w:t>- Đoạn 4: câu hỏi tu từ – trách nhiệm “tự trọng tấm thân mà ra sức báo đáp” của kẻ sĩ; là bước chuyển, nối lí lẽ về hiền tài với ý nghĩa của việc dựng bia.</w:t>
-            </w:r>
-          </w:p>
-          <w:p>
-            <w:pPr>
-              <w:spacing w:before="0" w:after="0"/>
-              <w:jc w:val="both"/>
-            </w:pPr>
-            <w:r>
-              <w:rPr>
-                <w:b w:val="0"/>
-                <w:i w:val="0"/>
-              </w:rPr>
-              <w:t>- Đoạn 5: ý nghĩa của bia (câu trực tiếp nói mục đích): “kẻ ác lấy đó làm răn, người thiện theo đó mà gắng, dẫn việc dĩ vãng, chỉ lối tương lai, vừa để rèn giũa danh tiếng cho sĩ phu, vừa để củng cố mệnh mạch cho nhà nước”.</w:t>
-            </w:r>
-          </w:p>
-          <w:p>
-            <w:pPr>
-              <w:spacing w:before="0" w:after="0"/>
-              <w:jc w:val="both"/>
-            </w:pPr>
-            <w:r>
-              <w:rPr>
-                <w:b w:val="0"/>
-                <w:i w:val="0"/>
-              </w:rPr>
-              <w:t>- Hai tư cách (người truyền đạt “thánh ý” và kẻ sĩ được trọng dụng) → giọng văn vừa trang trọng, uy nghiêm vừa tha thiết, khiêm nhường; luận điểm vừa có tính khẳng định vừa có tính khuyên răn, tự nhắc nhở.</w:t>
+              <w:t>- Đoạn 3: triển khai thêm ý về sự trọng đãi của triều đình; chứa câu trực tiếp nói mục đích dựng bia (theo SGV): “Nay thánh minh lại cho rằng, chuyện hay việc tốt tuy có một thời lừng lẫy, nhưng lời khen tiếng thơm chưa đủ lưu vẻ sáng lâu dài, cho nên lại dựng đá đề danh đặt ở cửa Hiền Quan, khiến cho kẻ sĩ trông vào mà phấn chấn hâm mộ, rèn luyện danh tiết, gắng sức giúp vua”. Đoạn 3 chuyển mạch lập luận từ nguyên lí chung sang chuyện cụ thể – dựng bia.</w:t>
+            </w:r>
+          </w:p>
+          <w:p>
+            <w:pPr>
+              <w:spacing w:before="0" w:after="0"/>
+              <w:jc w:val="both"/>
+            </w:pPr>
+            <w:r>
+              <w:rPr>
+                <w:b w:val="0"/>
+                <w:i w:val="0"/>
+              </w:rPr>
+              <w:t>- Đoạn 4: lời tự vấn thể hiện thái độ tự trọng của kẻ sĩ trước sự tôn vinh, kì vọng của triều đình, đất nước (cũng có thể xem là lời “khích tướng”, cổ vũ các bậc hiền tài); tạo bước chuyển để đoạn sau đi thẳng vào nội dung khuyến cáo.</w:t>
+            </w:r>
+          </w:p>
+          <w:p>
+            <w:pPr>
+              <w:spacing w:before="0" w:after="0"/>
+              <w:jc w:val="both"/>
+            </w:pPr>
+            <w:r>
+              <w:rPr>
+                <w:b w:val="0"/>
+                <w:i w:val="0"/>
+              </w:rPr>
+              <w:t>- Đoạn 5: ý nghĩa, tác dụng lâu dài của bia: “kẻ ác lấy đó làm răn, người thiện theo đó mà gắng, dẫn việc dĩ vãng, chỉ lối tương lai, vừa để rèn giũa danh tiếng cho sĩ phu, vừa để củng cố mệnh mạch cho nhà nước”.</w:t>
+            </w:r>
+          </w:p>
+          <w:p>
+            <w:pPr>
+              <w:spacing w:before="0" w:after="0"/>
+              <w:jc w:val="both"/>
+            </w:pPr>
+            <w:r>
+              <w:rPr>
+                <w:b w:val="0"/>
+                <w:i w:val="0"/>
+              </w:rPr>
+              <w:t>- Hai tư cách (người truyền đạt “thánh ý” và kẻ sĩ tự trọng) → cách triển khai luận điểm uyển chuyển, linh hoạt, vừa xác quyết rắn rỏi, dứt khoát, vừa thiết tha, giàu cảm xúc, hết sức thuyết phục (SGV tr.96).</w:t>
+            </w:r>
+          </w:p>
+          <w:p>
+            <w:pPr>
+              <w:spacing w:before="0" w:after="0"/>
+              <w:jc w:val="both"/>
+            </w:pPr>
+            <w:r>
+              <w:rPr>
+                <w:b w:val="0"/>
+                <w:i w:val="0"/>
+              </w:rPr>
+              <w:t>- Dẫn chứng lịch sử (câu hỏi 7): các triều đại thịnh trị đều trọng hiền tài – đời Lý Nhân Tông, Trần Nhân Tông, Lê Thánh Tông…; sự suy tàn của các triều đại cũng phản ánh hệ quả của việc xem nhẹ hiền tài.</w:t>
             </w:r>
           </w:p>
           <w:p>
@@ -1691,7 +1704,20 @@
           <w:b w:val="0"/>
           <w:i w:val="0"/>
         </w:rPr>
-        <w:t>- HS thảo luận nhóm 12 phút; nhóm 5, 6 có thể tra cứu (khoa thi Minh kinh bác học 1075, Lê Thánh Tông mở 12 khoa thi, Quang Trung ban Chiếu cầu hiền…).</w:t>
+        <w:t>- Đọc văn bản (theo SGV): 2 HS đọc trọn vẹn văn bản với giọng khoan thai, trang trọng, nhấn giọng ở những câu, cụm từ cuối mỗi đoạn; GV đọc lại, giải thích từ khó (tháp Nhạn, Long hổ, tiệc Văn hỉ, Hiền Quan…).</w:t>
+      </w:r>
+    </w:p>
+    <w:p>
+      <w:pPr>
+        <w:spacing w:before="0" w:after="0"/>
+        <w:jc w:val="both"/>
+      </w:pPr>
+      <w:r>
+        <w:rPr>
+          <w:b w:val="0"/>
+          <w:i w:val="0"/>
+        </w:rPr>
+        <w:t>- HS thảo luận nhóm 12 phút; nhóm 5, 6 có thể tra cứu dẫn chứng lịch sử (đời Lý Nhân Tông, Trần Nhân Tông, Lê Thánh Tông…).</w:t>
       </w:r>
     </w:p>
     <w:p>
@@ -1743,7 +1769,7 @@
           <w:b w:val="0"/>
           <w:i w:val="0"/>
         </w:rPr>
-        <w:t>- GV chốt mục III, IV; trả lời câu hỏi 8: xác định mục đích viết, quan điểm người viết giúp văn bản nghị luận có định hướng, tập trung, tăng sức thuyết phục.</w:t>
+        <w:t>- GV chốt mục III, IV; trả lời câu hỏi 8: xác định mục đích viết, quan điểm người viết giúp văn bản nghị luận có định hướng, tập trung, tăng sức thuyết phục (GV nhắc HS xem lại Tri thức ngữ văn).</w:t>
       </w:r>
     </w:p>
     <w:p>
@@ -3709,7 +3735,7 @@
           <w:b w:val="0"/>
           <w:i w:val="0"/>
         </w:rPr>
-        <w:t>- Hoạt động 3 (25 phút): Thảo luận theo nhóm 6 – 8 HS có người điều hành, thư kí; mỗi thành viên phát biểu, phản hồi; đại diện nhóm báo cáo kết quả trước lớp.</w:t>
+        <w:t>- Hoạt động 3 (25 phút): Thảo luận theo nhóm 6 – 8 HS có người điều hành, thư kí; GV mời lần lượt HS (theo danh sách dự kiến) trình bày ý kiến, duy trì trật tự, nhắc thời gian, cho ngừng những phát biểu trùng lặp để cuộc thảo luận xoáy vào vấn đề trung tâm; người điều hành tóm tắt các ý kiến, rút ra điểm đồng thuận.</w:t>
       </w:r>
     </w:p>
     <w:p>
@@ -3722,7 +3748,7 @@
           <w:b w:val="0"/>
           <w:i w:val="0"/>
         </w:rPr>
-        <w:t>- Hoạt động 4 (5 phút): Trao đổi, đánh giá theo bảng tiêu chí; rút kinh nghiệm về thái độ thảo luận (lắng nghe, không công kích cá nhân).</w:t>
+        <w:t>- Hoạt động 4 (5 phút): Trao đổi – HS ghi phiếu đánh giá (phát từ đầu tiết); GV đóng vai người tổng kết thảo luận, nhận xét ngắn gọn; thu phiếu làm căn cứ chấm điểm nói và nghe (SGV tr.111 – 112).</w:t>
       </w:r>
     </w:p>
     <w:p>
@@ -3766,6 +3792,19 @@
     </w:p>
     <w:p>
       <w:pPr>
+        <w:spacing w:before="80" w:after="0"/>
+        <w:jc w:val="center"/>
+      </w:pPr>
+      <w:r>
+        <w:rPr>
+          <w:b/>
+          <w:i w:val="0"/>
+        </w:rPr>
+        <w:t>1. Củng cố, mở rộng (SGK tr.94)</w:t>
+      </w:r>
+    </w:p>
+    <w:p>
+      <w:pPr>
         <w:spacing w:before="0" w:after="0"/>
         <w:jc w:val="both"/>
       </w:pPr>
@@ -3774,7 +3813,7 @@
           <w:b w:val="0"/>
           <w:i w:val="0"/>
         </w:rPr>
-        <w:t>- Củng cố (SGK tr.94): HS lập bảng so sánh luận đề, hệ thống luận điểm, cách sử dụng lí lẽ, bằng chứng của ba văn bản; nêu các yếu tố tạo nên sức thuyết phục của văn nghị luận.</w:t>
+        <w:t>- Theo SGV tr.112: GV hướng dẫn HS làm câu 1, 2, 3 vào vở bài tập; trao đổi nhóm câu 4; chia nhóm, đóng thành tập những văn bản nghị luận sưu tầm theo câu 5.</w:t>
       </w:r>
     </w:p>
     <w:p>
@@ -3787,7 +3826,445 @@
           <w:b w:val="0"/>
           <w:i w:val="0"/>
         </w:rPr>
-        <w:t>- Thực hành đọc: Thế giới mạng &amp; tôi (Nguyễn Thị Hậu, SGK tr.95 – 96) – chú ý cách nhìn nhận thế giới mạng qua trải nghiệm cá nhân, thái độ chủ động trước thế giới mạng, sức hấp dẫn riêng của nghị luận dưới hình thức tâm sự, thổ lộ.</w:t>
+        <w:t>&gt; 1. Ba văn bản đọc trong bài đã giúp bạn hiểu được gì về đặc điểm nội dung và hình thức của văn nghị luận?</w:t>
+      </w:r>
+    </w:p>
+    <w:p>
+      <w:pPr>
+        <w:spacing w:before="0" w:after="0"/>
+        <w:jc w:val="both"/>
+      </w:pPr>
+      <w:r>
+        <w:rPr>
+          <w:b w:val="0"/>
+          <w:i w:val="0"/>
+        </w:rPr>
+        <w:t>&gt; 2. Trong văn nghị luận, yếu tố tự sự có thể sử dụng ở những trường hợp nào và với mức độ ra sao?</w:t>
+      </w:r>
+    </w:p>
+    <w:p>
+      <w:pPr>
+        <w:spacing w:before="0" w:after="0"/>
+        <w:jc w:val="both"/>
+      </w:pPr>
+      <w:r>
+        <w:rPr>
+          <w:b w:val="0"/>
+          <w:i w:val="0"/>
+        </w:rPr>
+        <w:t>&gt; 3. Lập bảng hoặc sơ đồ tư duy so sánh các văn bản đọc theo: luận đề; cách triển khai luận điểm; cách nêu lí lẽ và bằng chứng; lí do chọn cách triển khai ấy.</w:t>
+      </w:r>
+    </w:p>
+    <w:p>
+      <w:pPr>
+        <w:spacing w:before="0" w:after="0"/>
+        <w:jc w:val="both"/>
+      </w:pPr>
+      <w:r>
+        <w:rPr>
+          <w:b w:val="0"/>
+          <w:i w:val="0"/>
+        </w:rPr>
+        <w:t>&gt; 4. Thảo luận nhóm về cách nhận diện đặc điểm riêng của văn bản nghị luận xã hội.</w:t>
+      </w:r>
+    </w:p>
+    <w:p>
+      <w:pPr>
+        <w:spacing w:before="0" w:after="0"/>
+        <w:jc w:val="both"/>
+      </w:pPr>
+      <w:r>
+        <w:rPr>
+          <w:b w:val="0"/>
+          <w:i w:val="0"/>
+        </w:rPr>
+        <w:t>&gt; 5. Tìm đọc thêm một số văn bản nghị luận liên quan đến nội dung đã học, tập hợp thành nhóm (bàn về việc trọng dụng nhân tài; bàn về những vấn đề cơ bản của sáng tạo nghệ thuật…).</w:t>
+      </w:r>
+    </w:p>
+    <w:p>
+      <w:pPr>
+        <w:spacing w:before="0" w:after="0"/>
+        <w:jc w:val="both"/>
+      </w:pPr>
+      <w:r>
+        <w:rPr>
+          <w:b w:val="0"/>
+          <w:i w:val="0"/>
+        </w:rPr>
+        <w:t>- Gợi ý bảng so sánh (câu 3):</w:t>
+      </w:r>
+    </w:p>
+    <w:tbl>
+      <w:tblPr>
+        <w:tblStyle w:val="TableGrid"/>
+        <w:tblW w:type="auto" w:w="0"/>
+        <w:jc w:val="center"/>
+        <w:tblLayout w:type="fixed"/>
+        <w:tblLook w:firstColumn="1" w:firstRow="1" w:lastColumn="0" w:lastRow="0" w:noHBand="0" w:noVBand="1" w:val="04A0"/>
+      </w:tblPr>
+      <w:tblGrid>
+        <w:gridCol w:w="2481"/>
+        <w:gridCol w:w="2481"/>
+        <w:gridCol w:w="2481"/>
+        <w:gridCol w:w="2481"/>
+      </w:tblGrid>
+      <w:tr>
+        <w:tc>
+          <w:tcPr>
+            <w:tcW w:type="dxa" w:w="2480"/>
+            <w:shd w:val="clear" w:color="auto" w:fill="DCE6F2"/>
+          </w:tcPr>
+          <w:p>
+            <w:pPr>
+              <w:spacing w:before="80" w:after="0"/>
+              <w:jc w:val="center"/>
+            </w:pPr>
+            <w:r>
+              <w:rPr>
+                <w:b/>
+                <w:i w:val="0"/>
+              </w:rPr>
+              <w:t>Văn bản</w:t>
+            </w:r>
+          </w:p>
+        </w:tc>
+        <w:tc>
+          <w:tcPr>
+            <w:tcW w:type="dxa" w:w="2480"/>
+            <w:shd w:val="clear" w:color="auto" w:fill="DCE6F2"/>
+          </w:tcPr>
+          <w:p>
+            <w:pPr>
+              <w:spacing w:before="80" w:after="0"/>
+              <w:jc w:val="center"/>
+            </w:pPr>
+            <w:r>
+              <w:rPr>
+                <w:b/>
+                <w:i w:val="0"/>
+              </w:rPr>
+              <w:t>Luận đề</w:t>
+            </w:r>
+          </w:p>
+        </w:tc>
+        <w:tc>
+          <w:tcPr>
+            <w:tcW w:type="dxa" w:w="2480"/>
+            <w:shd w:val="clear" w:color="auto" w:fill="DCE6F2"/>
+          </w:tcPr>
+          <w:p>
+            <w:pPr>
+              <w:spacing w:before="80" w:after="0"/>
+              <w:jc w:val="center"/>
+            </w:pPr>
+            <w:r>
+              <w:rPr>
+                <w:b/>
+                <w:i w:val="0"/>
+              </w:rPr>
+              <w:t>Cách triển khai luận điểm</w:t>
+            </w:r>
+          </w:p>
+        </w:tc>
+        <w:tc>
+          <w:tcPr>
+            <w:tcW w:type="dxa" w:w="2480"/>
+            <w:shd w:val="clear" w:color="auto" w:fill="DCE6F2"/>
+          </w:tcPr>
+          <w:p>
+            <w:pPr>
+              <w:spacing w:before="80" w:after="0"/>
+              <w:jc w:val="center"/>
+            </w:pPr>
+            <w:r>
+              <w:rPr>
+                <w:b/>
+                <w:i w:val="0"/>
+              </w:rPr>
+              <w:t>Lí lẽ, bằng chứng tiêu biểu</w:t>
+            </w:r>
+          </w:p>
+        </w:tc>
+      </w:tr>
+      <w:tr>
+        <w:tc>
+          <w:tcPr>
+            <w:tcW w:type="dxa" w:w="2480"/>
+          </w:tcPr>
+          <w:p>
+            <w:pPr>
+              <w:spacing w:before="0" w:after="0"/>
+              <w:jc w:val="both"/>
+            </w:pPr>
+            <w:r>
+              <w:rPr>
+                <w:b w:val="0"/>
+                <w:i w:val="0"/>
+              </w:rPr>
+              <w:t>Hiền tài là nguyên khí của quốc gia</w:t>
+            </w:r>
+          </w:p>
+        </w:tc>
+        <w:tc>
+          <w:tcPr>
+            <w:tcW w:type="dxa" w:w="2480"/>
+          </w:tcPr>
+          <w:p>
+            <w:pPr>
+              <w:spacing w:before="0" w:after="0"/>
+              <w:jc w:val="both"/>
+            </w:pPr>
+            <w:r>
+              <w:rPr>
+                <w:b w:val="0"/>
+                <w:i w:val="0"/>
+              </w:rPr>
+              <w:t>Vai trò của hiền tài đối với đất nước</w:t>
+            </w:r>
+          </w:p>
+        </w:tc>
+        <w:tc>
+          <w:tcPr>
+            <w:tcW w:type="dxa" w:w="2480"/>
+          </w:tcPr>
+          <w:p>
+            <w:pPr>
+              <w:spacing w:before="0" w:after="0"/>
+              <w:jc w:val="both"/>
+            </w:pPr>
+            <w:r>
+              <w:rPr>
+                <w:b w:val="0"/>
+                <w:i w:val="0"/>
+              </w:rPr>
+              <w:t>Nguyên lí chung → việc dựng bia → trách nhiệm kẻ sĩ → ý nghĩa của bia</w:t>
+            </w:r>
+          </w:p>
+        </w:tc>
+        <w:tc>
+          <w:tcPr>
+            <w:tcW w:type="dxa" w:w="2480"/>
+          </w:tcPr>
+          <w:p>
+            <w:pPr>
+              <w:spacing w:before="0" w:after="0"/>
+              <w:jc w:val="both"/>
+            </w:pPr>
+            <w:r>
+              <w:rPr>
+                <w:b w:val="0"/>
+                <w:i w:val="0"/>
+              </w:rPr>
+              <w:t>Các hình thức tôn vinh (tháp Nhạn, Long hổ, tiệc Văn hỉ); việc dựng bia ở cửa Hiền Quan</w:t>
+            </w:r>
+          </w:p>
+        </w:tc>
+      </w:tr>
+      <w:tr>
+        <w:tc>
+          <w:tcPr>
+            <w:tcW w:type="dxa" w:w="2480"/>
+          </w:tcPr>
+          <w:p>
+            <w:pPr>
+              <w:spacing w:before="0" w:after="0"/>
+              <w:jc w:val="both"/>
+            </w:pPr>
+            <w:r>
+              <w:rPr>
+                <w:b w:val="0"/>
+                <w:i w:val="0"/>
+              </w:rPr>
+              <w:t>Yêu và đồng cảm</w:t>
+            </w:r>
+          </w:p>
+        </w:tc>
+        <w:tc>
+          <w:tcPr>
+            <w:tcW w:type="dxa" w:w="2480"/>
+          </w:tcPr>
+          <w:p>
+            <w:pPr>
+              <w:spacing w:before="0" w:after="0"/>
+              <w:jc w:val="both"/>
+            </w:pPr>
+            <w:r>
+              <w:rPr>
+                <w:b w:val="0"/>
+                <w:i w:val="0"/>
+              </w:rPr>
+              <w:t>Vai trò của sự đồng cảm trong nghệ thuật và đời sống</w:t>
+            </w:r>
+          </w:p>
+        </w:tc>
+        <w:tc>
+          <w:tcPr>
+            <w:tcW w:type="dxa" w:w="2480"/>
+          </w:tcPr>
+          <w:p>
+            <w:pPr>
+              <w:spacing w:before="0" w:after="0"/>
+              <w:jc w:val="both"/>
+            </w:pPr>
+            <w:r>
+              <w:rPr>
+                <w:b w:val="0"/>
+                <w:i w:val="0"/>
+              </w:rPr>
+              <w:t>Từ trải nghiệm cá nhân → chiêm nghiệm → khái quát</w:t>
+            </w:r>
+          </w:p>
+        </w:tc>
+        <w:tc>
+          <w:tcPr>
+            <w:tcW w:type="dxa" w:w="2480"/>
+          </w:tcPr>
+          <w:p>
+            <w:pPr>
+              <w:spacing w:before="0" w:after="0"/>
+              <w:jc w:val="both"/>
+            </w:pPr>
+            <w:r>
+              <w:rPr>
+                <w:b w:val="0"/>
+                <w:i w:val="0"/>
+              </w:rPr>
+              <w:t>Câu chuyện chú bé; cái nhìn về gốc cây; trẻ em và nghệ sĩ</w:t>
+            </w:r>
+          </w:p>
+        </w:tc>
+      </w:tr>
+      <w:tr>
+        <w:tc>
+          <w:tcPr>
+            <w:tcW w:type="dxa" w:w="2480"/>
+          </w:tcPr>
+          <w:p>
+            <w:pPr>
+              <w:spacing w:before="0" w:after="0"/>
+              <w:jc w:val="both"/>
+            </w:pPr>
+            <w:r>
+              <w:rPr>
+                <w:b w:val="0"/>
+                <w:i w:val="0"/>
+              </w:rPr>
+              <w:t>Chữ bầu lên nhà thơ</w:t>
+            </w:r>
+          </w:p>
+        </w:tc>
+        <w:tc>
+          <w:tcPr>
+            <w:tcW w:type="dxa" w:w="2480"/>
+          </w:tcPr>
+          <w:p>
+            <w:pPr>
+              <w:spacing w:before="0" w:after="0"/>
+              <w:jc w:val="both"/>
+            </w:pPr>
+            <w:r>
+              <w:rPr>
+                <w:b w:val="0"/>
+                <w:i w:val="0"/>
+              </w:rPr>
+              <w:t>Lao động chữ nghĩa của nhà thơ</w:t>
+            </w:r>
+          </w:p>
+        </w:tc>
+        <w:tc>
+          <w:tcPr>
+            <w:tcW w:type="dxa" w:w="2480"/>
+          </w:tcPr>
+          <w:p>
+            <w:pPr>
+              <w:spacing w:before="0" w:after="0"/>
+              <w:jc w:val="both"/>
+            </w:pPr>
+            <w:r>
+              <w:rPr>
+                <w:b w:val="0"/>
+                <w:i w:val="0"/>
+              </w:rPr>
+              <w:t>Nêu quan niệm → đối thoại, phản bác → khẳng định</w:t>
+            </w:r>
+          </w:p>
+        </w:tc>
+        <w:tc>
+          <w:tcPr>
+            <w:tcW w:type="dxa" w:w="2480"/>
+          </w:tcPr>
+          <w:p>
+            <w:pPr>
+              <w:spacing w:before="0" w:after="0"/>
+              <w:jc w:val="both"/>
+            </w:pPr>
+            <w:r>
+              <w:rPr>
+                <w:b w:val="0"/>
+                <w:i w:val="0"/>
+              </w:rPr>
+              <w:t>Châm ngôn, so sánh; Tôn-xtôi, Phlô-be, Lý Bạch, Gớt, Ta-go…</w:t>
+            </w:r>
+          </w:p>
+        </w:tc>
+      </w:tr>
+    </w:tbl>
+    <w:p>
+      <w:pPr>
+        <w:spacing w:before="0" w:after="0"/>
+        <w:jc w:val="both"/>
+      </w:pPr>
+    </w:p>
+    <w:p>
+      <w:pPr>
+        <w:spacing w:before="80" w:after="0"/>
+        <w:jc w:val="center"/>
+      </w:pPr>
+      <w:r>
+        <w:rPr>
+          <w:b/>
+          <w:i w:val="0"/>
+        </w:rPr>
+        <w:t>2. Thực hành đọc: Thế giới mạng &amp; tôi (Nguyễn Thị Hậu, SGK tr.95 – 96)</w:t>
+      </w:r>
+    </w:p>
+    <w:p>
+      <w:pPr>
+        <w:spacing w:before="0" w:after="0"/>
+        <w:jc w:val="both"/>
+      </w:pPr>
+      <w:r>
+        <w:rPr>
+          <w:b w:val="0"/>
+          <w:i w:val="0"/>
+        </w:rPr>
+        <w:t>- Lưu ý khi đọc (SGK): cách nhìn nhận về thế giới mạng thông qua một trải nghiệm cá nhân; việc xác định thái độ chủ động trước thế giới mạng; sức hấp dẫn riêng của cách nghị luận dưới hình thức tâm sự, thổ lộ.</w:t>
+      </w:r>
+    </w:p>
+    <w:p>
+      <w:pPr>
+        <w:spacing w:before="0" w:after="0"/>
+        <w:jc w:val="both"/>
+      </w:pPr>
+      <w:r>
+        <w:rPr>
+          <w:b w:val="0"/>
+          <w:i w:val="0"/>
+        </w:rPr>
+        <w:t>- Gợi ý: thế giới mạng “như một tấm gương của cuộc sống… phóng đại nhiều lần những tốt đẹp hay xấu xa của mỗi con người, của một xã hội”; thái độ của người viết: “tỉnh táo để biết nhìn ra chân giá trị của mình, của người”.</w:t>
+      </w:r>
+    </w:p>
+    <w:p>
+      <w:pPr>
+        <w:spacing w:before="0" w:after="0"/>
+        <w:jc w:val="both"/>
+      </w:pPr>
+      <w:r>
+        <w:rPr>
+          <w:b w:val="0"/>
+          <w:i w:val="0"/>
+        </w:rPr>
+        <w:t>- HS đọc ở nhà, ghi câu trả lời vào vở; GV kiểm tra đầu tiết học bài mới.</w:t>
       </w:r>
     </w:p>
     <w:p>
@@ -5101,7 +5578,7 @@
           <w:b/>
           <w:i w:val="0"/>
         </w:rPr>
-        <w:t>Bảng đánh giá kĩ năng thảo luận</w:t>
+        <w:t>Bảng tự đánh giá cuộc thảo luận (SGK tr.94)</w:t>
       </w:r>
     </w:p>
     <w:tbl>
@@ -5229,7 +5706,7 @@
                 <w:b w:val="0"/>
                 <w:i w:val="0"/>
               </w:rPr>
-              <w:t>Xác định rõ vấn đề thảo luận</w:t>
+              <w:t>Chọn được vấn đề thảo luận đích đáng và bám sát vấn đề đó trong suốt quá trình thảo luận</w:t>
             </w:r>
           </w:p>
         </w:tc>
@@ -5289,7 +5766,7 @@
                 <w:b w:val="0"/>
                 <w:i w:val="0"/>
               </w:rPr>
-              <w:t>Nêu được ý kiến riêng có lí lẽ, bằng chứng</w:t>
+              <w:t>Nắm bắt được sự tiến triển của cuộc thảo luận để điều chỉnh nội dung ý kiến cho phù hợp</w:t>
             </w:r>
           </w:p>
         </w:tc>
@@ -5349,7 +5826,7 @@
                 <w:b w:val="0"/>
                 <w:i w:val="0"/>
               </w:rPr>
-              <w:t>Thể hiện rõ thái độ tán thành hay phản đối, có giải thích</w:t>
+              <w:t>Thể hiện được sự đa dạng của những góc nhìn khác nhau về vấn đề</w:t>
             </w:r>
           </w:p>
         </w:tc>
@@ -5409,7 +5886,7 @@
                 <w:b w:val="0"/>
                 <w:i w:val="0"/>
               </w:rPr>
-              <w:t>Lắng nghe, tôn trọng người đối thoại, không công kích cá nhân</w:t>
+              <w:t>Biết chốt lại những điểm đạt được sự nhất trí giữa những người tham gia thảo luận</w:t>
             </w:r>
           </w:p>
         </w:tc>
@@ -5469,7 +5946,7 @@
                 <w:b w:val="0"/>
                 <w:i w:val="0"/>
               </w:rPr>
-              <w:t>Góp phần tìm tiếng nói chung</w:t>
+              <w:t>Gợi ra được những điều cần tiếp tục suy nghĩ sau cuộc thảo luận</w:t>
             </w:r>
           </w:p>
         </w:tc>
@@ -5487,6 +5964,337 @@
         <w:tc>
           <w:tcPr>
             <w:tcW w:type="dxa" w:w="1417"/>
+          </w:tcPr>
+          <w:p>
+            <w:pPr>
+              <w:spacing w:before="0" w:after="0"/>
+              <w:jc w:val="both"/>
+            </w:pPr>
+          </w:p>
+        </w:tc>
+      </w:tr>
+      <w:tr>
+        <w:tc>
+          <w:tcPr>
+            <w:tcW w:type="dxa" w:w="794"/>
+          </w:tcPr>
+          <w:p>
+            <w:pPr>
+              <w:spacing w:before="0" w:after="0"/>
+              <w:jc w:val="both"/>
+            </w:pPr>
+            <w:r>
+              <w:rPr>
+                <w:b w:val="0"/>
+                <w:i w:val="0"/>
+              </w:rPr>
+              <w:t>6</w:t>
+            </w:r>
+          </w:p>
+        </w:tc>
+        <w:tc>
+          <w:tcPr>
+            <w:tcW w:type="dxa" w:w="6293"/>
+          </w:tcPr>
+          <w:p>
+            <w:pPr>
+              <w:spacing w:before="0" w:after="0"/>
+              <w:jc w:val="both"/>
+            </w:pPr>
+            <w:r>
+              <w:rPr>
+                <w:b w:val="0"/>
+                <w:i w:val="0"/>
+              </w:rPr>
+              <w:t>Góp phần tạo được không khí đối thoại cởi mở, tôn trọng lẫn nhau</w:t>
+            </w:r>
+          </w:p>
+        </w:tc>
+        <w:tc>
+          <w:tcPr>
+            <w:tcW w:type="dxa" w:w="1417"/>
+          </w:tcPr>
+          <w:p>
+            <w:pPr>
+              <w:spacing w:before="0" w:after="0"/>
+              <w:jc w:val="both"/>
+            </w:pPr>
+          </w:p>
+        </w:tc>
+        <w:tc>
+          <w:tcPr>
+            <w:tcW w:type="dxa" w:w="1417"/>
+          </w:tcPr>
+          <w:p>
+            <w:pPr>
+              <w:spacing w:before="0" w:after="0"/>
+              <w:jc w:val="both"/>
+            </w:pPr>
+          </w:p>
+        </w:tc>
+      </w:tr>
+    </w:tbl>
+    <w:p>
+      <w:pPr>
+        <w:spacing w:before="0" w:after="0"/>
+        <w:jc w:val="both"/>
+      </w:pPr>
+    </w:p>
+    <w:p>
+      <w:pPr>
+        <w:spacing w:before="80" w:after="0"/>
+        <w:jc w:val="center"/>
+      </w:pPr>
+      <w:r>
+        <w:rPr>
+          <w:b/>
+          <w:i w:val="0"/>
+        </w:rPr>
+        <w:t>Phiếu đánh giá người phát biểu (SGV tr.112)</w:t>
+      </w:r>
+    </w:p>
+    <w:tbl>
+      <w:tblPr>
+        <w:tblStyle w:val="TableGrid"/>
+        <w:tblW w:type="auto" w:w="0"/>
+        <w:jc w:val="center"/>
+        <w:tblLayout w:type="fixed"/>
+        <w:tblLook w:firstColumn="1" w:firstRow="1" w:lastColumn="0" w:lastRow="0" w:noHBand="0" w:noVBand="1" w:val="04A0"/>
+      </w:tblPr>
+      <w:tblGrid>
+        <w:gridCol w:w="2481"/>
+        <w:gridCol w:w="2481"/>
+        <w:gridCol w:w="2481"/>
+        <w:gridCol w:w="2481"/>
+      </w:tblGrid>
+      <w:tr>
+        <w:tc>
+          <w:tcPr>
+            <w:tcW w:type="dxa" w:w="2480"/>
+            <w:shd w:val="clear" w:color="auto" w:fill="DCE6F2"/>
+          </w:tcPr>
+          <w:p>
+            <w:pPr>
+              <w:spacing w:before="80" w:after="0"/>
+              <w:jc w:val="center"/>
+            </w:pPr>
+            <w:r>
+              <w:rPr>
+                <w:b/>
+                <w:i w:val="0"/>
+              </w:rPr>
+              <w:t>Tên người được đánh giá</w:t>
+            </w:r>
+          </w:p>
+        </w:tc>
+        <w:tc>
+          <w:tcPr>
+            <w:tcW w:type="dxa" w:w="2480"/>
+            <w:shd w:val="clear" w:color="auto" w:fill="DCE6F2"/>
+          </w:tcPr>
+          <w:p>
+            <w:pPr>
+              <w:spacing w:before="80" w:after="0"/>
+              <w:jc w:val="center"/>
+            </w:pPr>
+            <w:r>
+              <w:rPr>
+                <w:b/>
+                <w:i w:val="0"/>
+              </w:rPr>
+              <w:t>Căn cứ đánh giá</w:t>
+            </w:r>
+          </w:p>
+        </w:tc>
+        <w:tc>
+          <w:tcPr>
+            <w:tcW w:type="dxa" w:w="2480"/>
+            <w:shd w:val="clear" w:color="auto" w:fill="DCE6F2"/>
+          </w:tcPr>
+          <w:p>
+            <w:pPr>
+              <w:spacing w:before="80" w:after="0"/>
+              <w:jc w:val="center"/>
+            </w:pPr>
+            <w:r>
+              <w:rPr>
+                <w:b/>
+                <w:i w:val="0"/>
+              </w:rPr>
+              <w:t>Đạt</w:t>
+            </w:r>
+          </w:p>
+        </w:tc>
+        <w:tc>
+          <w:tcPr>
+            <w:tcW w:type="dxa" w:w="2480"/>
+            <w:shd w:val="clear" w:color="auto" w:fill="DCE6F2"/>
+          </w:tcPr>
+          <w:p>
+            <w:pPr>
+              <w:spacing w:before="80" w:after="0"/>
+              <w:jc w:val="center"/>
+            </w:pPr>
+            <w:r>
+              <w:rPr>
+                <w:b/>
+                <w:i w:val="0"/>
+              </w:rPr>
+              <w:t>Chưa đạt</w:t>
+            </w:r>
+          </w:p>
+        </w:tc>
+      </w:tr>
+      <w:tr>
+        <w:tc>
+          <w:tcPr>
+            <w:tcW w:type="dxa" w:w="2480"/>
+          </w:tcPr>
+          <w:p>
+            <w:pPr>
+              <w:spacing w:before="0" w:after="0"/>
+              <w:jc w:val="both"/>
+            </w:pPr>
+          </w:p>
+        </w:tc>
+        <w:tc>
+          <w:tcPr>
+            <w:tcW w:type="dxa" w:w="2480"/>
+          </w:tcPr>
+          <w:p>
+            <w:pPr>
+              <w:spacing w:before="0" w:after="0"/>
+              <w:jc w:val="both"/>
+            </w:pPr>
+            <w:r>
+              <w:rPr>
+                <w:b w:val="0"/>
+                <w:i w:val="0"/>
+              </w:rPr>
+              <w:t>Nội dung ý kiến tham gia thảo luận</w:t>
+            </w:r>
+          </w:p>
+        </w:tc>
+        <w:tc>
+          <w:tcPr>
+            <w:tcW w:type="dxa" w:w="2480"/>
+          </w:tcPr>
+          <w:p>
+            <w:pPr>
+              <w:spacing w:before="0" w:after="0"/>
+              <w:jc w:val="both"/>
+            </w:pPr>
+          </w:p>
+        </w:tc>
+        <w:tc>
+          <w:tcPr>
+            <w:tcW w:type="dxa" w:w="2480"/>
+          </w:tcPr>
+          <w:p>
+            <w:pPr>
+              <w:spacing w:before="0" w:after="0"/>
+              <w:jc w:val="both"/>
+            </w:pPr>
+          </w:p>
+        </w:tc>
+      </w:tr>
+      <w:tr>
+        <w:tc>
+          <w:tcPr>
+            <w:tcW w:type="dxa" w:w="2480"/>
+          </w:tcPr>
+          <w:p>
+            <w:pPr>
+              <w:spacing w:before="0" w:after="0"/>
+              <w:jc w:val="both"/>
+            </w:pPr>
+          </w:p>
+        </w:tc>
+        <w:tc>
+          <w:tcPr>
+            <w:tcW w:type="dxa" w:w="2480"/>
+          </w:tcPr>
+          <w:p>
+            <w:pPr>
+              <w:spacing w:before="0" w:after="0"/>
+              <w:jc w:val="both"/>
+            </w:pPr>
+            <w:r>
+              <w:rPr>
+                <w:b w:val="0"/>
+                <w:i w:val="0"/>
+              </w:rPr>
+              <w:t>Kĩ năng trình bày ý kiến</w:t>
+            </w:r>
+          </w:p>
+        </w:tc>
+        <w:tc>
+          <w:tcPr>
+            <w:tcW w:type="dxa" w:w="2480"/>
+          </w:tcPr>
+          <w:p>
+            <w:pPr>
+              <w:spacing w:before="0" w:after="0"/>
+              <w:jc w:val="both"/>
+            </w:pPr>
+          </w:p>
+        </w:tc>
+        <w:tc>
+          <w:tcPr>
+            <w:tcW w:type="dxa" w:w="2480"/>
+          </w:tcPr>
+          <w:p>
+            <w:pPr>
+              <w:spacing w:before="0" w:after="0"/>
+              <w:jc w:val="both"/>
+            </w:pPr>
+          </w:p>
+        </w:tc>
+      </w:tr>
+      <w:tr>
+        <w:tc>
+          <w:tcPr>
+            <w:tcW w:type="dxa" w:w="2480"/>
+          </w:tcPr>
+          <w:p>
+            <w:pPr>
+              <w:spacing w:before="0" w:after="0"/>
+              <w:jc w:val="both"/>
+            </w:pPr>
+          </w:p>
+        </w:tc>
+        <w:tc>
+          <w:tcPr>
+            <w:tcW w:type="dxa" w:w="2480"/>
+          </w:tcPr>
+          <w:p>
+            <w:pPr>
+              <w:spacing w:before="0" w:after="0"/>
+              <w:jc w:val="both"/>
+            </w:pPr>
+            <w:r>
+              <w:rPr>
+                <w:b w:val="0"/>
+                <w:i w:val="0"/>
+              </w:rPr>
+              <w:t>Kĩ năng tương tác trong thảo luận</w:t>
+            </w:r>
+          </w:p>
+        </w:tc>
+        <w:tc>
+          <w:tcPr>
+            <w:tcW w:type="dxa" w:w="2480"/>
+          </w:tcPr>
+          <w:p>
+            <w:pPr>
+              <w:spacing w:before="0" w:after="0"/>
+              <w:jc w:val="both"/>
+            </w:pPr>
+          </w:p>
+        </w:tc>
+        <w:tc>
+          <w:tcPr>
+            <w:tcW w:type="dxa" w:w="2480"/>
           </w:tcPr>
           <w:p>
             <w:pPr>

</xml_diff>